<commit_message>
Updating Python folder with new and current chapter notebooks
I've progressed partly through nearly 12 of the 13 chapters in the exam prep Python. Should hopefully finish most to all of it tomorrow, and begin onto the next parts of Python.
</commit_message>
<xml_diff>
--- a/Python/Jupyter Notebooks/Exercise Questions.docx
+++ b/Python/Jupyter Notebooks/Exercise Questions.docx
@@ -81,7 +81,544 @@
           <w:numId w:val="1"/>
         </w:numPr>
       </w:pPr>
-    </w:p>
+      <w:r>
+        <w:t>Complex Data Types in Python: Working with Lists &amp; Tuples in Python</w:t>
+      </w:r>
+    </w:p>
+    <w:p>
+      <w:pPr>
+        <w:pStyle w:val="ListParagraph"/>
+        <w:numPr>
+          <w:ilvl w:val="0"/>
+          <w:numId w:val="3"/>
+        </w:numPr>
+      </w:pPr>
+      <w:r>
+        <w:t>List some similarities between lists and tuples</w:t>
+      </w:r>
+    </w:p>
+    <w:p>
+      <w:pPr>
+        <w:pStyle w:val="ListParagraph"/>
+        <w:numPr>
+          <w:ilvl w:val="0"/>
+          <w:numId w:val="3"/>
+        </w:numPr>
+      </w:pPr>
+      <w:r>
+        <w:t>List some differences between lists and tuples</w:t>
+      </w:r>
+    </w:p>
+    <w:p>
+      <w:pPr>
+        <w:pStyle w:val="ListParagraph"/>
+        <w:numPr>
+          <w:ilvl w:val="0"/>
+          <w:numId w:val="3"/>
+        </w:numPr>
+      </w:pPr>
+      <w:r>
+        <w:t>Create a Python list and perform access, update and slicing operations</w:t>
+      </w:r>
+    </w:p>
+    <w:p>
+      <w:pPr>
+        <w:pStyle w:val="ListParagraph"/>
+        <w:numPr>
+          <w:ilvl w:val="0"/>
+          <w:numId w:val="3"/>
+        </w:numPr>
+      </w:pPr>
+      <w:r>
+        <w:t>Create a Python tuple and perform access and slicing operations</w:t>
+      </w:r>
+    </w:p>
+    <w:p>
+      <w:pPr>
+        <w:pStyle w:val="Heading1"/>
+        <w:numPr>
+          <w:ilvl w:val="0"/>
+          <w:numId w:val="1"/>
+        </w:numPr>
+      </w:pPr>
+      <w:r>
+        <w:t>Complex Data Types in Python: Working with Dictionaries &amp; Sets in Python</w:t>
+      </w:r>
+    </w:p>
+    <w:p>
+      <w:pPr>
+        <w:pStyle w:val="ListParagraph"/>
+        <w:numPr>
+          <w:ilvl w:val="0"/>
+          <w:numId w:val="4"/>
+        </w:numPr>
+      </w:pPr>
+      <w:r>
+        <w:t>List some features of dictionaries in Python</w:t>
+      </w:r>
+    </w:p>
+    <w:p>
+      <w:pPr>
+        <w:pStyle w:val="ListParagraph"/>
+        <w:numPr>
+          <w:ilvl w:val="0"/>
+          <w:numId w:val="4"/>
+        </w:numPr>
+      </w:pPr>
+      <w:r>
+        <w:t>Define the basic features of sets in Python</w:t>
+      </w:r>
+    </w:p>
+    <w:p>
+      <w:pPr>
+        <w:pStyle w:val="ListParagraph"/>
+        <w:numPr>
+          <w:ilvl w:val="0"/>
+          <w:numId w:val="4"/>
+        </w:numPr>
+      </w:pPr>
+      <w:r>
+        <w:t>List some similarities and differences between lists, dictionaries and sets in Python</w:t>
+      </w:r>
+    </w:p>
+    <w:p>
+      <w:pPr>
+        <w:pStyle w:val="Heading1"/>
+        <w:numPr>
+          <w:ilvl w:val="0"/>
+          <w:numId w:val="1"/>
+        </w:numPr>
+      </w:pPr>
+      <w:r>
+        <w:t>Conditional Statements &amp; Loops: If-else Control Structures in Python</w:t>
+      </w:r>
+    </w:p>
+    <w:p>
+      <w:pPr>
+        <w:pStyle w:val="ListParagraph"/>
+        <w:numPr>
+          <w:ilvl w:val="0"/>
+          <w:numId w:val="5"/>
+        </w:numPr>
+      </w:pPr>
+      <w:r>
+        <w:t>Change the order of precedence of operators in an expression e.g. 10 – 4 * 2</w:t>
+      </w:r>
+    </w:p>
+    <w:p>
+      <w:pPr>
+        <w:pStyle w:val="ListParagraph"/>
+        <w:numPr>
+          <w:ilvl w:val="0"/>
+          <w:numId w:val="5"/>
+        </w:numPr>
+      </w:pPr>
+      <w:r>
+        <w:t>Summarise the membership operators in Python</w:t>
+      </w:r>
+    </w:p>
+    <w:p>
+      <w:pPr>
+        <w:pStyle w:val="ListParagraph"/>
+        <w:numPr>
+          <w:ilvl w:val="0"/>
+          <w:numId w:val="5"/>
+        </w:numPr>
+      </w:pPr>
+      <w:r>
+        <w:t>Convert a string to a list of characters</w:t>
+      </w:r>
+    </w:p>
+    <w:p>
+      <w:pPr>
+        <w:pStyle w:val="Heading1"/>
+        <w:numPr>
+          <w:ilvl w:val="0"/>
+          <w:numId w:val="1"/>
+        </w:numPr>
+      </w:pPr>
+      <w:r>
+        <w:t>Conditional Statements &amp; Loops: The Basics of for Loops in Python</w:t>
+      </w:r>
+    </w:p>
+    <w:p>
+      <w:pPr>
+        <w:pStyle w:val="ListParagraph"/>
+        <w:numPr>
+          <w:ilvl w:val="0"/>
+          <w:numId w:val="6"/>
+        </w:numPr>
+      </w:pPr>
+      <w:r>
+        <w:t>Print the cubes (^3?) of all the elements in a list using a for loop</w:t>
+      </w:r>
+    </w:p>
+    <w:p>
+      <w:pPr>
+        <w:pStyle w:val="ListParagraph"/>
+        <w:numPr>
+          <w:ilvl w:val="0"/>
+          <w:numId w:val="6"/>
+        </w:numPr>
+      </w:pPr>
+      <w:r>
+        <w:t>Given the following 2-D list, create a 1-D list containing all the automobile company names: [[</w:t>
+      </w:r>
+      <w:proofErr w:type="spellStart"/>
+      <w:r>
+        <w:t>ʼVolkswagenʼ</w:t>
+      </w:r>
+      <w:proofErr w:type="spellEnd"/>
+      <w:r>
+        <w:t>, '</w:t>
+      </w:r>
+      <w:proofErr w:type="spellStart"/>
+      <w:r>
+        <w:t>Mercedesʼ</w:t>
+      </w:r>
+      <w:proofErr w:type="spellEnd"/>
+      <w:r>
+        <w:t>, '</w:t>
+      </w:r>
+      <w:proofErr w:type="spellStart"/>
+      <w:r>
+        <w:t>BMWʼ</w:t>
+      </w:r>
+      <w:proofErr w:type="spellEnd"/>
+      <w:r>
+        <w:t>], [</w:t>
+      </w:r>
+      <w:proofErr w:type="spellStart"/>
+      <w:r>
+        <w:t>ʻHondaʼ</w:t>
+      </w:r>
+      <w:proofErr w:type="spellEnd"/>
+      <w:r>
+        <w:t>, '</w:t>
+      </w:r>
+      <w:proofErr w:type="spellStart"/>
+      <w:r>
+        <w:t>Toyotaʼ</w:t>
+      </w:r>
+      <w:proofErr w:type="spellEnd"/>
+      <w:r>
+        <w:t>, '</w:t>
+      </w:r>
+      <w:proofErr w:type="spellStart"/>
+      <w:r>
+        <w:t>Mazdaʼ</w:t>
+      </w:r>
+      <w:proofErr w:type="spellEnd"/>
+      <w:r>
+        <w:t>]]</w:t>
+      </w:r>
+    </w:p>
+    <w:p>
+      <w:pPr>
+        <w:pStyle w:val="ListParagraph"/>
+        <w:numPr>
+          <w:ilvl w:val="0"/>
+          <w:numId w:val="6"/>
+        </w:numPr>
+      </w:pPr>
+      <w:r>
+        <w:lastRenderedPageBreak/>
+        <w:t xml:space="preserve">Use the range function to print </w:t>
+      </w:r>
+      <w:r>
+        <w:t>all</w:t>
+      </w:r>
+      <w:r>
+        <w:t xml:space="preserve"> the leap years in the 21st century</w:t>
+      </w:r>
+    </w:p>
+    <w:p>
+      <w:pPr>
+        <w:pStyle w:val="Heading1"/>
+        <w:numPr>
+          <w:ilvl w:val="0"/>
+          <w:numId w:val="1"/>
+        </w:numPr>
+      </w:pPr>
+      <w:r>
+        <w:t>Conditional Statements &amp; Loops: Advanced Operations Using for Loops in Python</w:t>
+      </w:r>
+    </w:p>
+    <w:p>
+      <w:pPr>
+        <w:pStyle w:val="ListParagraph"/>
+        <w:numPr>
+          <w:ilvl w:val="0"/>
+          <w:numId w:val="7"/>
+        </w:numPr>
+      </w:pPr>
+      <w:r>
+        <w:t>Write a for loop which iterates over a random list of numbers and prints them, except if they are divisible by 7</w:t>
+      </w:r>
+    </w:p>
+    <w:p>
+      <w:pPr>
+        <w:pStyle w:val="ListParagraph"/>
+        <w:numPr>
+          <w:ilvl w:val="0"/>
+          <w:numId w:val="7"/>
+        </w:numPr>
+      </w:pPr>
+      <w:r>
+        <w:t>Start with a random list of numbers. Use list comprehension to generate cubes of numbers from numbers in the original list, only if the original number is divisible by 3</w:t>
+      </w:r>
+    </w:p>
+    <w:p>
+      <w:pPr>
+        <w:pStyle w:val="Heading1"/>
+        <w:numPr>
+          <w:ilvl w:val="0"/>
+          <w:numId w:val="1"/>
+        </w:numPr>
+      </w:pPr>
+      <w:r>
+        <w:t>Conditional Statements &amp; Loops: While Loops in Python</w:t>
+      </w:r>
+    </w:p>
+    <w:p>
+      <w:pPr>
+        <w:pStyle w:val="ListParagraph"/>
+        <w:numPr>
+          <w:ilvl w:val="0"/>
+          <w:numId w:val="8"/>
+        </w:numPr>
+      </w:pPr>
+      <w:r>
+        <w:t>Compare for and while loops</w:t>
+      </w:r>
+    </w:p>
+    <w:p>
+      <w:pPr>
+        <w:pStyle w:val="ListParagraph"/>
+        <w:numPr>
+          <w:ilvl w:val="0"/>
+          <w:numId w:val="8"/>
+        </w:numPr>
+      </w:pPr>
+      <w:r>
+        <w:t>Write code to repeatedly prompt the user for the capital of Egypt until they give the correct value (Cairo) or they give up and enter quit</w:t>
+      </w:r>
+    </w:p>
+    <w:p>
+      <w:pPr>
+        <w:pStyle w:val="Heading1"/>
+        <w:numPr>
+          <w:ilvl w:val="0"/>
+          <w:numId w:val="1"/>
+        </w:numPr>
+      </w:pPr>
+      <w:r>
+        <w:t>Functions in Python: Introduction</w:t>
+      </w:r>
+    </w:p>
+    <w:p>
+      <w:pPr>
+        <w:pStyle w:val="ListParagraph"/>
+        <w:numPr>
+          <w:ilvl w:val="0"/>
+          <w:numId w:val="9"/>
+        </w:numPr>
+      </w:pPr>
+      <w:r>
+        <w:t>Describe what functions are, and how they are useful in programming</w:t>
+      </w:r>
+    </w:p>
+    <w:p>
+      <w:pPr>
+        <w:pStyle w:val="ListParagraph"/>
+        <w:numPr>
+          <w:ilvl w:val="0"/>
+          <w:numId w:val="9"/>
+        </w:numPr>
+      </w:pPr>
+      <w:r>
+        <w:t>Describe how you pass information to, and get information from functions</w:t>
+      </w:r>
+    </w:p>
+    <w:p>
+      <w:pPr>
+        <w:pStyle w:val="ListParagraph"/>
+        <w:numPr>
+          <w:ilvl w:val="1"/>
+          <w:numId w:val="9"/>
+        </w:numPr>
+      </w:pPr>
+      <w:r>
+        <w:t>You pass it either via arguments, or by referring within the function to global variables define outside the function</w:t>
+      </w:r>
+    </w:p>
+    <w:p>
+      <w:pPr>
+        <w:pStyle w:val="ListParagraph"/>
+        <w:numPr>
+          <w:ilvl w:val="2"/>
+          <w:numId w:val="9"/>
+        </w:numPr>
+      </w:pPr>
+      <w:r>
+        <w:t xml:space="preserve">Incorrect? If you try to make a global variable equal to a value, </w:t>
+      </w:r>
+      <w:proofErr w:type="spellStart"/>
+      <w:r>
+        <w:t>tochange</w:t>
+      </w:r>
+      <w:proofErr w:type="spellEnd"/>
+      <w:r>
+        <w:t xml:space="preserve"> it, what you’re actually doing is just creating a local variable???</w:t>
+      </w:r>
+    </w:p>
+    <w:p>
+      <w:pPr>
+        <w:pStyle w:val="ListParagraph"/>
+        <w:numPr>
+          <w:ilvl w:val="1"/>
+          <w:numId w:val="9"/>
+        </w:numPr>
+      </w:pPr>
+      <w:r>
+        <w:t>You get it from functions by either returning a value with the return keyword, or by modifying a global variable referred within the function (not quite passing a value, but it does update the variable due to the function)</w:t>
+      </w:r>
+    </w:p>
+    <w:p>
+      <w:pPr>
+        <w:pStyle w:val="ListParagraph"/>
+        <w:numPr>
+          <w:ilvl w:val="0"/>
+          <w:numId w:val="9"/>
+        </w:numPr>
+      </w:pPr>
+      <w:r>
+        <w:t>List the differences between positional arguments and keyword arguments</w:t>
+      </w:r>
+    </w:p>
+    <w:p>
+      <w:pPr>
+        <w:pStyle w:val="Heading1"/>
+        <w:numPr>
+          <w:ilvl w:val="0"/>
+          <w:numId w:val="1"/>
+        </w:numPr>
+      </w:pPr>
+      <w:r>
+        <w:t>Functions in Python: Gaining a Deeper Understanding of Python Functions</w:t>
+      </w:r>
+    </w:p>
+    <w:p>
+      <w:pPr>
+        <w:pStyle w:val="ListParagraph"/>
+        <w:numPr>
+          <w:ilvl w:val="0"/>
+          <w:numId w:val="10"/>
+        </w:numPr>
+      </w:pPr>
+      <w:r>
+        <w:t>Describe the differences between global and local</w:t>
+      </w:r>
+      <w:r>
+        <w:t xml:space="preserve"> </w:t>
+      </w:r>
+      <w:r>
+        <w:t>variables</w:t>
+      </w:r>
+    </w:p>
+    <w:p>
+      <w:pPr>
+        <w:pStyle w:val="ListParagraph"/>
+        <w:numPr>
+          <w:ilvl w:val="0"/>
+          <w:numId w:val="10"/>
+        </w:numPr>
+      </w:pPr>
+      <w:r>
+        <w:t>List the characteristics of working with complex data</w:t>
+      </w:r>
+      <w:r>
+        <w:t xml:space="preserve"> </w:t>
+      </w:r>
+      <w:r>
+        <w:t>types passed by reference</w:t>
+      </w:r>
+    </w:p>
+    <w:p>
+      <w:pPr>
+        <w:pStyle w:val="ListParagraph"/>
+        <w:numPr>
+          <w:ilvl w:val="0"/>
+          <w:numId w:val="10"/>
+        </w:numPr>
+      </w:pPr>
+      <w:r>
+        <w:t>Specify all the reasons why functions are considered first</w:t>
+      </w:r>
+      <w:r>
+        <w:t xml:space="preserve"> </w:t>
+      </w:r>
+      <w:r>
+        <w:t>class citizens in Python</w:t>
+      </w:r>
+    </w:p>
+    <w:p>
+      <w:pPr>
+        <w:pStyle w:val="ListParagraph"/>
+        <w:numPr>
+          <w:ilvl w:val="0"/>
+          <w:numId w:val="10"/>
+        </w:numPr>
+      </w:pPr>
+      <w:r>
+        <w:t>List the characteristics and use cases of lambdas in</w:t>
+      </w:r>
+      <w:r>
+        <w:t xml:space="preserve"> </w:t>
+      </w:r>
+      <w:r>
+        <w:t>Python</w:t>
+      </w:r>
+    </w:p>
+    <w:p>
+      <w:pPr>
+        <w:pStyle w:val="Heading1"/>
+        <w:numPr>
+          <w:ilvl w:val="0"/>
+          <w:numId w:val="1"/>
+        </w:numPr>
+      </w:pPr>
+      <w:r>
+        <w:lastRenderedPageBreak/>
+        <w:t>…</w:t>
+      </w:r>
+    </w:p>
+    <w:p>
+      <w:pPr>
+        <w:pStyle w:val="Heading1"/>
+        <w:numPr>
+          <w:ilvl w:val="0"/>
+          <w:numId w:val="1"/>
+        </w:numPr>
+      </w:pPr>
+      <w:r>
+        <w:t>…</w:t>
+      </w:r>
+    </w:p>
+    <w:p>
+      <w:pPr>
+        <w:pStyle w:val="Heading1"/>
+        <w:numPr>
+          <w:ilvl w:val="0"/>
+          <w:numId w:val="1"/>
+        </w:numPr>
+      </w:pPr>
+      <w:r>
+        <w:t>…</w:t>
+      </w:r>
+    </w:p>
+    <w:p/>
+    <w:p/>
     <w:sectPr>
       <w:pgSz w:w="11906" w:h="16838"/>
       <w:pgMar w:top="1440" w:right="1440" w:bottom="1440" w:left="1440" w:header="708" w:footer="708" w:gutter="0"/>
@@ -95,6 +632,92 @@
 <file path=word/numbering.xml><?xml version="1.0" encoding="utf-8"?>
 <w:numbering xmlns:wpc="http://schemas.microsoft.com/office/word/2010/wordprocessingCanvas" xmlns:cx="http://schemas.microsoft.com/office/drawing/2014/chartex" xmlns:cx1="http://schemas.microsoft.com/office/drawing/2015/9/8/chartex" xmlns:cx2="http://schemas.microsoft.com/office/drawing/2015/10/21/chartex" xmlns:cx3="http://schemas.microsoft.com/office/drawing/2016/5/9/chartex" xmlns:cx4="http://schemas.microsoft.com/office/drawing/2016/5/10/chartex" xmlns:cx5="http://schemas.microsoft.com/office/drawing/2016/5/11/chartex" xmlns:cx6="http://schemas.microsoft.com/office/drawing/2016/5/12/chartex" xmlns:cx7="http://schemas.microsoft.com/office/drawing/2016/5/13/chartex" xmlns:cx8="http://schemas.microsoft.com/office/drawing/2016/5/14/chartex" xmlns:mc="http://schemas.openxmlformats.org/markup-compatibility/2006" xmlns:aink="http://schemas.microsoft.com/office/drawing/2016/ink" xmlns:am3d="http://schemas.microsoft.com/office/drawing/2017/model3d" xmlns:o="urn:schemas-microsoft-com:office:office" xmlns:oel="http://schemas.microsoft.com/office/2019/extlst" xmlns:r="http://schemas.openxmlformats.org/officeDocument/2006/relationships" xmlns:m="http://schemas.openxmlformats.org/officeDocument/2006/math" xmlns:v="urn:schemas-microsoft-com:vml" xmlns:wp14="http://schemas.microsoft.com/office/word/2010/wordprocessingDrawing" xmlns:wp="http://schemas.openxmlformats.org/drawingml/2006/wordprocessingDrawing" xmlns:w10="urn:schemas-microsoft-com:office:word" xmlns:w="http://schemas.openxmlformats.org/wordprocessingml/2006/main" xmlns:w14="http://schemas.microsoft.com/office/word/2010/wordml" xmlns:w15="http://schemas.microsoft.com/office/word/2012/wordml" xmlns:w16cex="http://schemas.microsoft.com/office/word/2018/wordml/cex" xmlns:w16cid="http://schemas.microsoft.com/office/word/2016/wordml/cid" xmlns:w16="http://schemas.microsoft.com/office/word/2018/wordml" xmlns:w16du="http://schemas.microsoft.com/office/word/2023/wordml/word16du" xmlns:w16sdtdh="http://schemas.microsoft.com/office/word/2020/wordml/sdtdatahash" xmlns:w16sdtfl="http://schemas.microsoft.com/office/word/2024/wordml/sdtformatlock" xmlns:w16se="http://schemas.microsoft.com/office/word/2015/wordml/symex" xmlns:wpg="http://schemas.microsoft.com/office/word/2010/wordprocessingGroup" xmlns:wpi="http://schemas.microsoft.com/office/word/2010/wordprocessingInk" xmlns:wne="http://schemas.microsoft.com/office/word/2006/wordml" xmlns:wps="http://schemas.microsoft.com/office/word/2010/wordprocessingShape" mc:Ignorable="w14 w15 w16se w16cid w16 w16cex w16sdtdh w16sdtfl w16du wp14">
   <w:abstractNum w:abstractNumId="0" w15:restartNumberingAfterBreak="0">
+    <w:nsid w:val="01387BAE"/>
+    <w:multiLevelType w:val="hybridMultilevel"/>
+    <w:tmpl w:val="336ADAD0"/>
+    <w:lvl w:ilvl="0" w:tplc="0C09000F">
+      <w:start w:val="1"/>
+      <w:numFmt w:val="decimal"/>
+      <w:lvlText w:val="%1."/>
+      <w:lvlJc w:val="left"/>
+      <w:pPr>
+        <w:ind w:left="360" w:hanging="360"/>
+      </w:pPr>
+    </w:lvl>
+    <w:lvl w:ilvl="1" w:tplc="0C090019" w:tentative="1">
+      <w:start w:val="1"/>
+      <w:numFmt w:val="lowerLetter"/>
+      <w:lvlText w:val="%2."/>
+      <w:lvlJc w:val="left"/>
+      <w:pPr>
+        <w:ind w:left="1080" w:hanging="360"/>
+      </w:pPr>
+    </w:lvl>
+    <w:lvl w:ilvl="2" w:tplc="0C09001B" w:tentative="1">
+      <w:start w:val="1"/>
+      <w:numFmt w:val="lowerRoman"/>
+      <w:lvlText w:val="%3."/>
+      <w:lvlJc w:val="right"/>
+      <w:pPr>
+        <w:ind w:left="1800" w:hanging="180"/>
+      </w:pPr>
+    </w:lvl>
+    <w:lvl w:ilvl="3" w:tplc="0C09000F" w:tentative="1">
+      <w:start w:val="1"/>
+      <w:numFmt w:val="decimal"/>
+      <w:lvlText w:val="%4."/>
+      <w:lvlJc w:val="left"/>
+      <w:pPr>
+        <w:ind w:left="2520" w:hanging="360"/>
+      </w:pPr>
+    </w:lvl>
+    <w:lvl w:ilvl="4" w:tplc="0C090019" w:tentative="1">
+      <w:start w:val="1"/>
+      <w:numFmt w:val="lowerLetter"/>
+      <w:lvlText w:val="%5."/>
+      <w:lvlJc w:val="left"/>
+      <w:pPr>
+        <w:ind w:left="3240" w:hanging="360"/>
+      </w:pPr>
+    </w:lvl>
+    <w:lvl w:ilvl="5" w:tplc="0C09001B" w:tentative="1">
+      <w:start w:val="1"/>
+      <w:numFmt w:val="lowerRoman"/>
+      <w:lvlText w:val="%6."/>
+      <w:lvlJc w:val="right"/>
+      <w:pPr>
+        <w:ind w:left="3960" w:hanging="180"/>
+      </w:pPr>
+    </w:lvl>
+    <w:lvl w:ilvl="6" w:tplc="0C09000F" w:tentative="1">
+      <w:start w:val="1"/>
+      <w:numFmt w:val="decimal"/>
+      <w:lvlText w:val="%7."/>
+      <w:lvlJc w:val="left"/>
+      <w:pPr>
+        <w:ind w:left="4680" w:hanging="360"/>
+      </w:pPr>
+    </w:lvl>
+    <w:lvl w:ilvl="7" w:tplc="0C090019" w:tentative="1">
+      <w:start w:val="1"/>
+      <w:numFmt w:val="lowerLetter"/>
+      <w:lvlText w:val="%8."/>
+      <w:lvlJc w:val="left"/>
+      <w:pPr>
+        <w:ind w:left="5400" w:hanging="360"/>
+      </w:pPr>
+    </w:lvl>
+    <w:lvl w:ilvl="8" w:tplc="0C09001B" w:tentative="1">
+      <w:start w:val="1"/>
+      <w:numFmt w:val="lowerRoman"/>
+      <w:lvlText w:val="%9."/>
+      <w:lvlJc w:val="right"/>
+      <w:pPr>
+        <w:ind w:left="6120" w:hanging="180"/>
+      </w:pPr>
+    </w:lvl>
+  </w:abstractNum>
+  <w:abstractNum w:abstractNumId="1" w15:restartNumberingAfterBreak="0">
     <w:nsid w:val="02F7621A"/>
     <w:multiLevelType w:val="hybridMultilevel"/>
     <w:tmpl w:val="ADE6CD16"/>
@@ -180,7 +803,179 @@
       </w:pPr>
     </w:lvl>
   </w:abstractNum>
-  <w:abstractNum w:abstractNumId="1" w15:restartNumberingAfterBreak="0">
+  <w:abstractNum w:abstractNumId="2" w15:restartNumberingAfterBreak="0">
+    <w:nsid w:val="0DB204F5"/>
+    <w:multiLevelType w:val="hybridMultilevel"/>
+    <w:tmpl w:val="993040A4"/>
+    <w:lvl w:ilvl="0" w:tplc="0C09000F">
+      <w:start w:val="1"/>
+      <w:numFmt w:val="decimal"/>
+      <w:lvlText w:val="%1."/>
+      <w:lvlJc w:val="left"/>
+      <w:pPr>
+        <w:ind w:left="360" w:hanging="360"/>
+      </w:pPr>
+    </w:lvl>
+    <w:lvl w:ilvl="1" w:tplc="0C090019" w:tentative="1">
+      <w:start w:val="1"/>
+      <w:numFmt w:val="lowerLetter"/>
+      <w:lvlText w:val="%2."/>
+      <w:lvlJc w:val="left"/>
+      <w:pPr>
+        <w:ind w:left="1080" w:hanging="360"/>
+      </w:pPr>
+    </w:lvl>
+    <w:lvl w:ilvl="2" w:tplc="0C09001B" w:tentative="1">
+      <w:start w:val="1"/>
+      <w:numFmt w:val="lowerRoman"/>
+      <w:lvlText w:val="%3."/>
+      <w:lvlJc w:val="right"/>
+      <w:pPr>
+        <w:ind w:left="1800" w:hanging="180"/>
+      </w:pPr>
+    </w:lvl>
+    <w:lvl w:ilvl="3" w:tplc="0C09000F" w:tentative="1">
+      <w:start w:val="1"/>
+      <w:numFmt w:val="decimal"/>
+      <w:lvlText w:val="%4."/>
+      <w:lvlJc w:val="left"/>
+      <w:pPr>
+        <w:ind w:left="2520" w:hanging="360"/>
+      </w:pPr>
+    </w:lvl>
+    <w:lvl w:ilvl="4" w:tplc="0C090019" w:tentative="1">
+      <w:start w:val="1"/>
+      <w:numFmt w:val="lowerLetter"/>
+      <w:lvlText w:val="%5."/>
+      <w:lvlJc w:val="left"/>
+      <w:pPr>
+        <w:ind w:left="3240" w:hanging="360"/>
+      </w:pPr>
+    </w:lvl>
+    <w:lvl w:ilvl="5" w:tplc="0C09001B" w:tentative="1">
+      <w:start w:val="1"/>
+      <w:numFmt w:val="lowerRoman"/>
+      <w:lvlText w:val="%6."/>
+      <w:lvlJc w:val="right"/>
+      <w:pPr>
+        <w:ind w:left="3960" w:hanging="180"/>
+      </w:pPr>
+    </w:lvl>
+    <w:lvl w:ilvl="6" w:tplc="0C09000F" w:tentative="1">
+      <w:start w:val="1"/>
+      <w:numFmt w:val="decimal"/>
+      <w:lvlText w:val="%7."/>
+      <w:lvlJc w:val="left"/>
+      <w:pPr>
+        <w:ind w:left="4680" w:hanging="360"/>
+      </w:pPr>
+    </w:lvl>
+    <w:lvl w:ilvl="7" w:tplc="0C090019" w:tentative="1">
+      <w:start w:val="1"/>
+      <w:numFmt w:val="lowerLetter"/>
+      <w:lvlText w:val="%8."/>
+      <w:lvlJc w:val="left"/>
+      <w:pPr>
+        <w:ind w:left="5400" w:hanging="360"/>
+      </w:pPr>
+    </w:lvl>
+    <w:lvl w:ilvl="8" w:tplc="0C09001B" w:tentative="1">
+      <w:start w:val="1"/>
+      <w:numFmt w:val="lowerRoman"/>
+      <w:lvlText w:val="%9."/>
+      <w:lvlJc w:val="right"/>
+      <w:pPr>
+        <w:ind w:left="6120" w:hanging="180"/>
+      </w:pPr>
+    </w:lvl>
+  </w:abstractNum>
+  <w:abstractNum w:abstractNumId="3" w15:restartNumberingAfterBreak="0">
+    <w:nsid w:val="0E4F19A2"/>
+    <w:multiLevelType w:val="hybridMultilevel"/>
+    <w:tmpl w:val="46A0BB9E"/>
+    <w:lvl w:ilvl="0" w:tplc="0C09000F">
+      <w:start w:val="1"/>
+      <w:numFmt w:val="decimal"/>
+      <w:lvlText w:val="%1."/>
+      <w:lvlJc w:val="left"/>
+      <w:pPr>
+        <w:ind w:left="360" w:hanging="360"/>
+      </w:pPr>
+    </w:lvl>
+    <w:lvl w:ilvl="1" w:tplc="0C090019" w:tentative="1">
+      <w:start w:val="1"/>
+      <w:numFmt w:val="lowerLetter"/>
+      <w:lvlText w:val="%2."/>
+      <w:lvlJc w:val="left"/>
+      <w:pPr>
+        <w:ind w:left="1080" w:hanging="360"/>
+      </w:pPr>
+    </w:lvl>
+    <w:lvl w:ilvl="2" w:tplc="0C09001B" w:tentative="1">
+      <w:start w:val="1"/>
+      <w:numFmt w:val="lowerRoman"/>
+      <w:lvlText w:val="%3."/>
+      <w:lvlJc w:val="right"/>
+      <w:pPr>
+        <w:ind w:left="1800" w:hanging="180"/>
+      </w:pPr>
+    </w:lvl>
+    <w:lvl w:ilvl="3" w:tplc="0C09000F" w:tentative="1">
+      <w:start w:val="1"/>
+      <w:numFmt w:val="decimal"/>
+      <w:lvlText w:val="%4."/>
+      <w:lvlJc w:val="left"/>
+      <w:pPr>
+        <w:ind w:left="2520" w:hanging="360"/>
+      </w:pPr>
+    </w:lvl>
+    <w:lvl w:ilvl="4" w:tplc="0C090019" w:tentative="1">
+      <w:start w:val="1"/>
+      <w:numFmt w:val="lowerLetter"/>
+      <w:lvlText w:val="%5."/>
+      <w:lvlJc w:val="left"/>
+      <w:pPr>
+        <w:ind w:left="3240" w:hanging="360"/>
+      </w:pPr>
+    </w:lvl>
+    <w:lvl w:ilvl="5" w:tplc="0C09001B" w:tentative="1">
+      <w:start w:val="1"/>
+      <w:numFmt w:val="lowerRoman"/>
+      <w:lvlText w:val="%6."/>
+      <w:lvlJc w:val="right"/>
+      <w:pPr>
+        <w:ind w:left="3960" w:hanging="180"/>
+      </w:pPr>
+    </w:lvl>
+    <w:lvl w:ilvl="6" w:tplc="0C09000F" w:tentative="1">
+      <w:start w:val="1"/>
+      <w:numFmt w:val="decimal"/>
+      <w:lvlText w:val="%7."/>
+      <w:lvlJc w:val="left"/>
+      <w:pPr>
+        <w:ind w:left="4680" w:hanging="360"/>
+      </w:pPr>
+    </w:lvl>
+    <w:lvl w:ilvl="7" w:tplc="0C090019" w:tentative="1">
+      <w:start w:val="1"/>
+      <w:numFmt w:val="lowerLetter"/>
+      <w:lvlText w:val="%8."/>
+      <w:lvlJc w:val="left"/>
+      <w:pPr>
+        <w:ind w:left="5400" w:hanging="360"/>
+      </w:pPr>
+    </w:lvl>
+    <w:lvl w:ilvl="8" w:tplc="0C09001B" w:tentative="1">
+      <w:start w:val="1"/>
+      <w:numFmt w:val="lowerRoman"/>
+      <w:lvlText w:val="%9."/>
+      <w:lvlJc w:val="right"/>
+      <w:pPr>
+        <w:ind w:left="6120" w:hanging="180"/>
+      </w:pPr>
+    </w:lvl>
+  </w:abstractNum>
+  <w:abstractNum w:abstractNumId="4" w15:restartNumberingAfterBreak="0">
     <w:nsid w:val="1E500C9C"/>
     <w:multiLevelType w:val="hybridMultilevel"/>
     <w:tmpl w:val="54E6650E"/>
@@ -269,11 +1064,465 @@
       </w:pPr>
     </w:lvl>
   </w:abstractNum>
+  <w:abstractNum w:abstractNumId="5" w15:restartNumberingAfterBreak="0">
+    <w:nsid w:val="25197340"/>
+    <w:multiLevelType w:val="hybridMultilevel"/>
+    <w:tmpl w:val="81840554"/>
+    <w:lvl w:ilvl="0" w:tplc="0C09000F">
+      <w:start w:val="1"/>
+      <w:numFmt w:val="decimal"/>
+      <w:lvlText w:val="%1."/>
+      <w:lvlJc w:val="left"/>
+      <w:pPr>
+        <w:ind w:left="360" w:hanging="360"/>
+      </w:pPr>
+    </w:lvl>
+    <w:lvl w:ilvl="1" w:tplc="0C090019" w:tentative="1">
+      <w:start w:val="1"/>
+      <w:numFmt w:val="lowerLetter"/>
+      <w:lvlText w:val="%2."/>
+      <w:lvlJc w:val="left"/>
+      <w:pPr>
+        <w:ind w:left="1080" w:hanging="360"/>
+      </w:pPr>
+    </w:lvl>
+    <w:lvl w:ilvl="2" w:tplc="0C09001B" w:tentative="1">
+      <w:start w:val="1"/>
+      <w:numFmt w:val="lowerRoman"/>
+      <w:lvlText w:val="%3."/>
+      <w:lvlJc w:val="right"/>
+      <w:pPr>
+        <w:ind w:left="1800" w:hanging="180"/>
+      </w:pPr>
+    </w:lvl>
+    <w:lvl w:ilvl="3" w:tplc="0C09000F" w:tentative="1">
+      <w:start w:val="1"/>
+      <w:numFmt w:val="decimal"/>
+      <w:lvlText w:val="%4."/>
+      <w:lvlJc w:val="left"/>
+      <w:pPr>
+        <w:ind w:left="2520" w:hanging="360"/>
+      </w:pPr>
+    </w:lvl>
+    <w:lvl w:ilvl="4" w:tplc="0C090019" w:tentative="1">
+      <w:start w:val="1"/>
+      <w:numFmt w:val="lowerLetter"/>
+      <w:lvlText w:val="%5."/>
+      <w:lvlJc w:val="left"/>
+      <w:pPr>
+        <w:ind w:left="3240" w:hanging="360"/>
+      </w:pPr>
+    </w:lvl>
+    <w:lvl w:ilvl="5" w:tplc="0C09001B" w:tentative="1">
+      <w:start w:val="1"/>
+      <w:numFmt w:val="lowerRoman"/>
+      <w:lvlText w:val="%6."/>
+      <w:lvlJc w:val="right"/>
+      <w:pPr>
+        <w:ind w:left="3960" w:hanging="180"/>
+      </w:pPr>
+    </w:lvl>
+    <w:lvl w:ilvl="6" w:tplc="0C09000F" w:tentative="1">
+      <w:start w:val="1"/>
+      <w:numFmt w:val="decimal"/>
+      <w:lvlText w:val="%7."/>
+      <w:lvlJc w:val="left"/>
+      <w:pPr>
+        <w:ind w:left="4680" w:hanging="360"/>
+      </w:pPr>
+    </w:lvl>
+    <w:lvl w:ilvl="7" w:tplc="0C090019" w:tentative="1">
+      <w:start w:val="1"/>
+      <w:numFmt w:val="lowerLetter"/>
+      <w:lvlText w:val="%8."/>
+      <w:lvlJc w:val="left"/>
+      <w:pPr>
+        <w:ind w:left="5400" w:hanging="360"/>
+      </w:pPr>
+    </w:lvl>
+    <w:lvl w:ilvl="8" w:tplc="0C09001B" w:tentative="1">
+      <w:start w:val="1"/>
+      <w:numFmt w:val="lowerRoman"/>
+      <w:lvlText w:val="%9."/>
+      <w:lvlJc w:val="right"/>
+      <w:pPr>
+        <w:ind w:left="6120" w:hanging="180"/>
+      </w:pPr>
+    </w:lvl>
+  </w:abstractNum>
+  <w:abstractNum w:abstractNumId="6" w15:restartNumberingAfterBreak="0">
+    <w:nsid w:val="455F0CD1"/>
+    <w:multiLevelType w:val="hybridMultilevel"/>
+    <w:tmpl w:val="9C7A5D54"/>
+    <w:lvl w:ilvl="0" w:tplc="0C09000F">
+      <w:start w:val="1"/>
+      <w:numFmt w:val="decimal"/>
+      <w:lvlText w:val="%1."/>
+      <w:lvlJc w:val="left"/>
+      <w:pPr>
+        <w:ind w:left="360" w:hanging="360"/>
+      </w:pPr>
+    </w:lvl>
+    <w:lvl w:ilvl="1" w:tplc="0C090019" w:tentative="1">
+      <w:start w:val="1"/>
+      <w:numFmt w:val="lowerLetter"/>
+      <w:lvlText w:val="%2."/>
+      <w:lvlJc w:val="left"/>
+      <w:pPr>
+        <w:ind w:left="1080" w:hanging="360"/>
+      </w:pPr>
+    </w:lvl>
+    <w:lvl w:ilvl="2" w:tplc="0C09001B" w:tentative="1">
+      <w:start w:val="1"/>
+      <w:numFmt w:val="lowerRoman"/>
+      <w:lvlText w:val="%3."/>
+      <w:lvlJc w:val="right"/>
+      <w:pPr>
+        <w:ind w:left="1800" w:hanging="180"/>
+      </w:pPr>
+    </w:lvl>
+    <w:lvl w:ilvl="3" w:tplc="0C09000F" w:tentative="1">
+      <w:start w:val="1"/>
+      <w:numFmt w:val="decimal"/>
+      <w:lvlText w:val="%4."/>
+      <w:lvlJc w:val="left"/>
+      <w:pPr>
+        <w:ind w:left="2520" w:hanging="360"/>
+      </w:pPr>
+    </w:lvl>
+    <w:lvl w:ilvl="4" w:tplc="0C090019" w:tentative="1">
+      <w:start w:val="1"/>
+      <w:numFmt w:val="lowerLetter"/>
+      <w:lvlText w:val="%5."/>
+      <w:lvlJc w:val="left"/>
+      <w:pPr>
+        <w:ind w:left="3240" w:hanging="360"/>
+      </w:pPr>
+    </w:lvl>
+    <w:lvl w:ilvl="5" w:tplc="0C09001B" w:tentative="1">
+      <w:start w:val="1"/>
+      <w:numFmt w:val="lowerRoman"/>
+      <w:lvlText w:val="%6."/>
+      <w:lvlJc w:val="right"/>
+      <w:pPr>
+        <w:ind w:left="3960" w:hanging="180"/>
+      </w:pPr>
+    </w:lvl>
+    <w:lvl w:ilvl="6" w:tplc="0C09000F" w:tentative="1">
+      <w:start w:val="1"/>
+      <w:numFmt w:val="decimal"/>
+      <w:lvlText w:val="%7."/>
+      <w:lvlJc w:val="left"/>
+      <w:pPr>
+        <w:ind w:left="4680" w:hanging="360"/>
+      </w:pPr>
+    </w:lvl>
+    <w:lvl w:ilvl="7" w:tplc="0C090019" w:tentative="1">
+      <w:start w:val="1"/>
+      <w:numFmt w:val="lowerLetter"/>
+      <w:lvlText w:val="%8."/>
+      <w:lvlJc w:val="left"/>
+      <w:pPr>
+        <w:ind w:left="5400" w:hanging="360"/>
+      </w:pPr>
+    </w:lvl>
+    <w:lvl w:ilvl="8" w:tplc="0C09001B" w:tentative="1">
+      <w:start w:val="1"/>
+      <w:numFmt w:val="lowerRoman"/>
+      <w:lvlText w:val="%9."/>
+      <w:lvlJc w:val="right"/>
+      <w:pPr>
+        <w:ind w:left="6120" w:hanging="180"/>
+      </w:pPr>
+    </w:lvl>
+  </w:abstractNum>
+  <w:abstractNum w:abstractNumId="7" w15:restartNumberingAfterBreak="0">
+    <w:nsid w:val="531B6E34"/>
+    <w:multiLevelType w:val="hybridMultilevel"/>
+    <w:tmpl w:val="19566276"/>
+    <w:lvl w:ilvl="0" w:tplc="0C09000F">
+      <w:start w:val="1"/>
+      <w:numFmt w:val="decimal"/>
+      <w:lvlText w:val="%1."/>
+      <w:lvlJc w:val="left"/>
+      <w:pPr>
+        <w:ind w:left="360" w:hanging="360"/>
+      </w:pPr>
+    </w:lvl>
+    <w:lvl w:ilvl="1" w:tplc="0C090019">
+      <w:start w:val="1"/>
+      <w:numFmt w:val="lowerLetter"/>
+      <w:lvlText w:val="%2."/>
+      <w:lvlJc w:val="left"/>
+      <w:pPr>
+        <w:ind w:left="1080" w:hanging="360"/>
+      </w:pPr>
+    </w:lvl>
+    <w:lvl w:ilvl="2" w:tplc="0C09001B">
+      <w:start w:val="1"/>
+      <w:numFmt w:val="lowerRoman"/>
+      <w:lvlText w:val="%3."/>
+      <w:lvlJc w:val="right"/>
+      <w:pPr>
+        <w:ind w:left="1800" w:hanging="180"/>
+      </w:pPr>
+    </w:lvl>
+    <w:lvl w:ilvl="3" w:tplc="0C09000F" w:tentative="1">
+      <w:start w:val="1"/>
+      <w:numFmt w:val="decimal"/>
+      <w:lvlText w:val="%4."/>
+      <w:lvlJc w:val="left"/>
+      <w:pPr>
+        <w:ind w:left="2520" w:hanging="360"/>
+      </w:pPr>
+    </w:lvl>
+    <w:lvl w:ilvl="4" w:tplc="0C090019" w:tentative="1">
+      <w:start w:val="1"/>
+      <w:numFmt w:val="lowerLetter"/>
+      <w:lvlText w:val="%5."/>
+      <w:lvlJc w:val="left"/>
+      <w:pPr>
+        <w:ind w:left="3240" w:hanging="360"/>
+      </w:pPr>
+    </w:lvl>
+    <w:lvl w:ilvl="5" w:tplc="0C09001B" w:tentative="1">
+      <w:start w:val="1"/>
+      <w:numFmt w:val="lowerRoman"/>
+      <w:lvlText w:val="%6."/>
+      <w:lvlJc w:val="right"/>
+      <w:pPr>
+        <w:ind w:left="3960" w:hanging="180"/>
+      </w:pPr>
+    </w:lvl>
+    <w:lvl w:ilvl="6" w:tplc="0C09000F" w:tentative="1">
+      <w:start w:val="1"/>
+      <w:numFmt w:val="decimal"/>
+      <w:lvlText w:val="%7."/>
+      <w:lvlJc w:val="left"/>
+      <w:pPr>
+        <w:ind w:left="4680" w:hanging="360"/>
+      </w:pPr>
+    </w:lvl>
+    <w:lvl w:ilvl="7" w:tplc="0C090019" w:tentative="1">
+      <w:start w:val="1"/>
+      <w:numFmt w:val="lowerLetter"/>
+      <w:lvlText w:val="%8."/>
+      <w:lvlJc w:val="left"/>
+      <w:pPr>
+        <w:ind w:left="5400" w:hanging="360"/>
+      </w:pPr>
+    </w:lvl>
+    <w:lvl w:ilvl="8" w:tplc="0C09001B" w:tentative="1">
+      <w:start w:val="1"/>
+      <w:numFmt w:val="lowerRoman"/>
+      <w:lvlText w:val="%9."/>
+      <w:lvlJc w:val="right"/>
+      <w:pPr>
+        <w:ind w:left="6120" w:hanging="180"/>
+      </w:pPr>
+    </w:lvl>
+  </w:abstractNum>
+  <w:abstractNum w:abstractNumId="8" w15:restartNumberingAfterBreak="0">
+    <w:nsid w:val="647E0162"/>
+    <w:multiLevelType w:val="hybridMultilevel"/>
+    <w:tmpl w:val="8F066926"/>
+    <w:lvl w:ilvl="0" w:tplc="0C09000F">
+      <w:start w:val="1"/>
+      <w:numFmt w:val="decimal"/>
+      <w:lvlText w:val="%1."/>
+      <w:lvlJc w:val="left"/>
+      <w:pPr>
+        <w:ind w:left="360" w:hanging="360"/>
+      </w:pPr>
+    </w:lvl>
+    <w:lvl w:ilvl="1" w:tplc="0C090019">
+      <w:start w:val="1"/>
+      <w:numFmt w:val="lowerLetter"/>
+      <w:lvlText w:val="%2."/>
+      <w:lvlJc w:val="left"/>
+      <w:pPr>
+        <w:ind w:left="1080" w:hanging="360"/>
+      </w:pPr>
+    </w:lvl>
+    <w:lvl w:ilvl="2" w:tplc="0C09001B" w:tentative="1">
+      <w:start w:val="1"/>
+      <w:numFmt w:val="lowerRoman"/>
+      <w:lvlText w:val="%3."/>
+      <w:lvlJc w:val="right"/>
+      <w:pPr>
+        <w:ind w:left="1800" w:hanging="180"/>
+      </w:pPr>
+    </w:lvl>
+    <w:lvl w:ilvl="3" w:tplc="0C09000F" w:tentative="1">
+      <w:start w:val="1"/>
+      <w:numFmt w:val="decimal"/>
+      <w:lvlText w:val="%4."/>
+      <w:lvlJc w:val="left"/>
+      <w:pPr>
+        <w:ind w:left="2520" w:hanging="360"/>
+      </w:pPr>
+    </w:lvl>
+    <w:lvl w:ilvl="4" w:tplc="0C090019" w:tentative="1">
+      <w:start w:val="1"/>
+      <w:numFmt w:val="lowerLetter"/>
+      <w:lvlText w:val="%5."/>
+      <w:lvlJc w:val="left"/>
+      <w:pPr>
+        <w:ind w:left="3240" w:hanging="360"/>
+      </w:pPr>
+    </w:lvl>
+    <w:lvl w:ilvl="5" w:tplc="0C09001B" w:tentative="1">
+      <w:start w:val="1"/>
+      <w:numFmt w:val="lowerRoman"/>
+      <w:lvlText w:val="%6."/>
+      <w:lvlJc w:val="right"/>
+      <w:pPr>
+        <w:ind w:left="3960" w:hanging="180"/>
+      </w:pPr>
+    </w:lvl>
+    <w:lvl w:ilvl="6" w:tplc="0C09000F" w:tentative="1">
+      <w:start w:val="1"/>
+      <w:numFmt w:val="decimal"/>
+      <w:lvlText w:val="%7."/>
+      <w:lvlJc w:val="left"/>
+      <w:pPr>
+        <w:ind w:left="4680" w:hanging="360"/>
+      </w:pPr>
+    </w:lvl>
+    <w:lvl w:ilvl="7" w:tplc="0C090019" w:tentative="1">
+      <w:start w:val="1"/>
+      <w:numFmt w:val="lowerLetter"/>
+      <w:lvlText w:val="%8."/>
+      <w:lvlJc w:val="left"/>
+      <w:pPr>
+        <w:ind w:left="5400" w:hanging="360"/>
+      </w:pPr>
+    </w:lvl>
+    <w:lvl w:ilvl="8" w:tplc="0C09001B" w:tentative="1">
+      <w:start w:val="1"/>
+      <w:numFmt w:val="lowerRoman"/>
+      <w:lvlText w:val="%9."/>
+      <w:lvlJc w:val="right"/>
+      <w:pPr>
+        <w:ind w:left="6120" w:hanging="180"/>
+      </w:pPr>
+    </w:lvl>
+  </w:abstractNum>
+  <w:abstractNum w:abstractNumId="9" w15:restartNumberingAfterBreak="0">
+    <w:nsid w:val="76376D87"/>
+    <w:multiLevelType w:val="hybridMultilevel"/>
+    <w:tmpl w:val="31CCB1B8"/>
+    <w:lvl w:ilvl="0" w:tplc="0C09000F">
+      <w:start w:val="1"/>
+      <w:numFmt w:val="decimal"/>
+      <w:lvlText w:val="%1."/>
+      <w:lvlJc w:val="left"/>
+      <w:pPr>
+        <w:ind w:left="360" w:hanging="360"/>
+      </w:pPr>
+    </w:lvl>
+    <w:lvl w:ilvl="1" w:tplc="0C090019" w:tentative="1">
+      <w:start w:val="1"/>
+      <w:numFmt w:val="lowerLetter"/>
+      <w:lvlText w:val="%2."/>
+      <w:lvlJc w:val="left"/>
+      <w:pPr>
+        <w:ind w:left="1080" w:hanging="360"/>
+      </w:pPr>
+    </w:lvl>
+    <w:lvl w:ilvl="2" w:tplc="0C09001B" w:tentative="1">
+      <w:start w:val="1"/>
+      <w:numFmt w:val="lowerRoman"/>
+      <w:lvlText w:val="%3."/>
+      <w:lvlJc w:val="right"/>
+      <w:pPr>
+        <w:ind w:left="1800" w:hanging="180"/>
+      </w:pPr>
+    </w:lvl>
+    <w:lvl w:ilvl="3" w:tplc="0C09000F" w:tentative="1">
+      <w:start w:val="1"/>
+      <w:numFmt w:val="decimal"/>
+      <w:lvlText w:val="%4."/>
+      <w:lvlJc w:val="left"/>
+      <w:pPr>
+        <w:ind w:left="2520" w:hanging="360"/>
+      </w:pPr>
+    </w:lvl>
+    <w:lvl w:ilvl="4" w:tplc="0C090019" w:tentative="1">
+      <w:start w:val="1"/>
+      <w:numFmt w:val="lowerLetter"/>
+      <w:lvlText w:val="%5."/>
+      <w:lvlJc w:val="left"/>
+      <w:pPr>
+        <w:ind w:left="3240" w:hanging="360"/>
+      </w:pPr>
+    </w:lvl>
+    <w:lvl w:ilvl="5" w:tplc="0C09001B" w:tentative="1">
+      <w:start w:val="1"/>
+      <w:numFmt w:val="lowerRoman"/>
+      <w:lvlText w:val="%6."/>
+      <w:lvlJc w:val="right"/>
+      <w:pPr>
+        <w:ind w:left="3960" w:hanging="180"/>
+      </w:pPr>
+    </w:lvl>
+    <w:lvl w:ilvl="6" w:tplc="0C09000F" w:tentative="1">
+      <w:start w:val="1"/>
+      <w:numFmt w:val="decimal"/>
+      <w:lvlText w:val="%7."/>
+      <w:lvlJc w:val="left"/>
+      <w:pPr>
+        <w:ind w:left="4680" w:hanging="360"/>
+      </w:pPr>
+    </w:lvl>
+    <w:lvl w:ilvl="7" w:tplc="0C090019" w:tentative="1">
+      <w:start w:val="1"/>
+      <w:numFmt w:val="lowerLetter"/>
+      <w:lvlText w:val="%8."/>
+      <w:lvlJc w:val="left"/>
+      <w:pPr>
+        <w:ind w:left="5400" w:hanging="360"/>
+      </w:pPr>
+    </w:lvl>
+    <w:lvl w:ilvl="8" w:tplc="0C09001B" w:tentative="1">
+      <w:start w:val="1"/>
+      <w:numFmt w:val="lowerRoman"/>
+      <w:lvlText w:val="%9."/>
+      <w:lvlJc w:val="right"/>
+      <w:pPr>
+        <w:ind w:left="6120" w:hanging="180"/>
+      </w:pPr>
+    </w:lvl>
+  </w:abstractNum>
   <w:num w:numId="1" w16cid:durableId="2107849789">
+    <w:abstractNumId w:val="4"/>
+  </w:num>
+  <w:num w:numId="2" w16cid:durableId="62677054">
     <w:abstractNumId w:val="1"/>
   </w:num>
-  <w:num w:numId="2" w16cid:durableId="62677054">
+  <w:num w:numId="3" w16cid:durableId="13266437">
+    <w:abstractNumId w:val="9"/>
+  </w:num>
+  <w:num w:numId="4" w16cid:durableId="422267791">
     <w:abstractNumId w:val="0"/>
+  </w:num>
+  <w:num w:numId="5" w16cid:durableId="1347094626">
+    <w:abstractNumId w:val="6"/>
+  </w:num>
+  <w:num w:numId="6" w16cid:durableId="2063403392">
+    <w:abstractNumId w:val="5"/>
+  </w:num>
+  <w:num w:numId="7" w16cid:durableId="1629895647">
+    <w:abstractNumId w:val="2"/>
+  </w:num>
+  <w:num w:numId="8" w16cid:durableId="230163027">
+    <w:abstractNumId w:val="8"/>
+  </w:num>
+  <w:num w:numId="9" w16cid:durableId="546375478">
+    <w:abstractNumId w:val="7"/>
+  </w:num>
+  <w:num w:numId="10" w16cid:durableId="867840900">
+    <w:abstractNumId w:val="3"/>
   </w:num>
 </w:numbering>
 </file>

</xml_diff>